<commit_message>
Remove Comments from document to prevent Id duplication. Test for hyperlinks
</commit_message>
<xml_diff>
--- a/DocxTemplater.Test/Resources/ComplexTemplate.docx
+++ b/DocxTemplater.Test/Resources/ComplexTemplate.docx
@@ -72,21 +72,12 @@
           <w:lang w:val="en-US"/>
         </w:rPr>
       </w:pPr>
-      <w:proofErr w:type="gramStart"/>
-      <w:r>
-        <w:rPr>
-          <w:lang w:val="en-US"/>
-        </w:rPr>
-        <w:t>{?{</w:t>
-      </w:r>
-      <w:proofErr w:type="gramEnd"/>
-      <w:r>
-        <w:rPr>
-          <w:lang w:val="en-US"/>
-        </w:rPr>
-        <w:t>.</w:t>
-      </w:r>
-      <w:proofErr w:type="spellStart"/>
+      <w:r>
+        <w:rPr>
+          <w:lang w:val="en-US"/>
+        </w:rPr>
+        <w:t>{?{.</w:t>
+      </w:r>
       <w:r>
         <w:rPr>
           <w:rFonts w:ascii="Cascadia Mono" w:hAnsi="Cascadia Mono" w:cs="Cascadia Mono"/>
@@ -98,7 +89,6 @@
         </w:rPr>
         <w:t>IsHw</w:t>
       </w:r>
-      <w:proofErr w:type="spellEnd"/>
       <w:r>
         <w:rPr>
           <w:lang w:val="en-US"/>
@@ -135,29 +125,7 @@
           <w:szCs w:val="28"/>
           <w:lang w:val="en-US"/>
         </w:rPr>
-        <w:t>{</w:t>
-      </w:r>
-      <w:proofErr w:type="gramStart"/>
-      <w:r>
-        <w:rPr>
-          <w:b/>
-          <w:bCs/>
-          <w:sz w:val="28"/>
-          <w:szCs w:val="28"/>
-          <w:lang w:val="en-US"/>
-        </w:rPr>
-        <w:t>{.Name</w:t>
-      </w:r>
-      <w:proofErr w:type="gramEnd"/>
-      <w:r>
-        <w:rPr>
-          <w:b/>
-          <w:bCs/>
-          <w:sz w:val="28"/>
-          <w:szCs w:val="28"/>
-          <w:lang w:val="en-US"/>
-        </w:rPr>
-        <w:t>}}</w:t>
+        <w:t>{{.Name}}</w:t>
       </w:r>
     </w:p>
     <w:p>
@@ -176,7 +144,6 @@
         </w:rPr>
         <w:t>{{</w:t>
       </w:r>
-      <w:proofErr w:type="gramStart"/>
       <w:r>
         <w:rPr>
           <w:lang w:val="en-US"/>
@@ -205,14 +172,7 @@
         <w:rPr>
           <w:lang w:val="en-US"/>
         </w:rPr>
-        <w:t>Revisions</w:t>
-      </w:r>
-      <w:proofErr w:type="gramEnd"/>
-      <w:r>
-        <w:rPr>
-          <w:lang w:val="en-US"/>
-        </w:rPr>
-        <w:t>}}</w:t>
+        <w:t>Revisions}}</w:t>
       </w:r>
     </w:p>
     <w:p>
@@ -225,183 +185,118 @@
           <w:lang w:val="en-US"/>
         </w:rPr>
       </w:pPr>
-      <w:proofErr w:type="gramStart"/>
-      <w:r>
-        <w:rPr>
-          <w:lang w:val="en-US"/>
-        </w:rPr>
-        <w:t>{?{</w:t>
-      </w:r>
-      <w:proofErr w:type="gramEnd"/>
+      <w:r>
+        <w:rPr>
+          <w:lang w:val="en-US"/>
+        </w:rPr>
+        <w:t>{?{.</w:t>
+      </w:r>
+      <w:r>
+        <w:rPr>
+          <w:lang w:val="en-US"/>
+        </w:rPr>
+        <w:t>IsMajor</w:t>
+      </w:r>
+      <w:r>
+        <w:rPr>
+          <w:lang w:val="en-US"/>
+        </w:rPr>
+        <w:t>}}{{.Version}:toupper}{{:}}{{.Version</w:t>
+      </w:r>
+      <w:r>
+        <w:rPr>
+          <w:lang w:val="en-US"/>
+        </w:rPr>
+        <w:t>}:</w:t>
+      </w:r>
+      <w:r>
+        <w:rPr>
+          <w:lang w:val="en-US"/>
+        </w:rPr>
+        <w:t>tolower}</w:t>
+      </w:r>
+      <w:r>
+        <w:rPr>
+          <w:lang w:val="en-US"/>
+        </w:rPr>
+        <w:t>{{/}}</w:t>
+      </w:r>
+    </w:p>
+    <w:p>
+      <w:pPr>
+        <w:tabs>
+          <w:tab w:val="left" w:pos="7594"/>
+        </w:tabs>
+        <w:ind w:left="1416"/>
+        <w:rPr>
+          <w:lang w:val="en-US"/>
+        </w:rPr>
+      </w:pPr>
+      <w:commentRangeStart w:id="0"/>
+      <w:r>
+        <w:rPr>
+          <w:lang w:val="en-US"/>
+        </w:rPr>
+        <w:t>Render the whole object (calls ToString)</w:t>
+      </w:r>
+      <w:r>
+        <w:rPr>
+          <w:lang w:val="en-US"/>
+        </w:rPr>
+        <w:t>: {{.}}</w:t>
+      </w:r>
+      <w:r>
+        <w:rPr>
+          <w:lang w:val="en-US"/>
+        </w:rPr>
+        <w:t xml:space="preserve"> </w:t>
+      </w:r>
+      <w:bookmarkStart w:id="1" w:name="OLE_LINK2"/>
+      <w:r>
+        <w:rPr>
+          <w:lang w:val="en-US"/>
+        </w:rPr>
+        <w:t>‘</w:t>
+      </w:r>
+      <w:bookmarkEnd w:id="1"/>
+      <w:commentRangeEnd w:id="0"/>
+      <w:r>
+        <w:rPr>
+          <w:rStyle w:val="Kommentarzeichen"/>
+          <w:sz w:val="22"/>
+          <w:szCs w:val="22"/>
+          <w:lang w:val="en-US"/>
+        </w:rPr>
+        <w:commentReference w:id="0"/>
+      </w:r>
+    </w:p>
+    <w:p>
+      <w:pPr>
+        <w:tabs>
+          <w:tab w:val="left" w:pos="7594"/>
+        </w:tabs>
+        <w:ind w:left="708"/>
+        <w:rPr>
+          <w:lang w:val="en-US"/>
+        </w:rPr>
+      </w:pPr>
+      <w:r>
+        <w:rPr>
+          <w:lang w:val="en-US"/>
+        </w:rPr>
+        <w:t>{{/</w:t>
+      </w:r>
       <w:r>
         <w:rPr>
           <w:lang w:val="en-US"/>
         </w:rPr>
         <w:t>.</w:t>
       </w:r>
-      <w:proofErr w:type="spellStart"/>
-      <w:r>
-        <w:rPr>
-          <w:lang w:val="en-US"/>
-        </w:rPr>
-        <w:t>IsMajor</w:t>
-      </w:r>
-      <w:proofErr w:type="spellEnd"/>
-      <w:r>
-        <w:rPr>
-          <w:lang w:val="en-US"/>
-        </w:rPr>
-        <w:t>}}{{.Version}:</w:t>
-      </w:r>
-      <w:proofErr w:type="spellStart"/>
-      <w:r>
-        <w:rPr>
-          <w:lang w:val="en-US"/>
-        </w:rPr>
-        <w:t>toupper</w:t>
-      </w:r>
-      <w:proofErr w:type="spellEnd"/>
-      <w:r>
-        <w:rPr>
-          <w:lang w:val="en-US"/>
-        </w:rPr>
-        <w:t>}{{:}}{{.Version</w:t>
-      </w:r>
-      <w:r>
-        <w:rPr>
-          <w:lang w:val="en-US"/>
-        </w:rPr>
-        <w:t>}:</w:t>
-      </w:r>
-      <w:proofErr w:type="spellStart"/>
-      <w:r>
-        <w:rPr>
-          <w:lang w:val="en-US"/>
-        </w:rPr>
-        <w:t>tolower</w:t>
-      </w:r>
-      <w:proofErr w:type="spellEnd"/>
-      <w:r>
-        <w:rPr>
-          <w:lang w:val="en-US"/>
-        </w:rPr>
-        <w:t>}</w:t>
-      </w:r>
-      <w:r>
-        <w:rPr>
-          <w:lang w:val="en-US"/>
-        </w:rPr>
-        <w:t>{{/}}</w:t>
-      </w:r>
-    </w:p>
-    <w:p>
-      <w:pPr>
-        <w:tabs>
-          <w:tab w:val="left" w:pos="7594"/>
-        </w:tabs>
-        <w:ind w:left="1416"/>
-        <w:rPr>
-          <w:lang w:val="en-US"/>
-        </w:rPr>
-      </w:pPr>
-      <w:r>
-        <w:rPr>
-          <w:lang w:val="en-US"/>
-        </w:rPr>
-        <w:t>Render the whole object (</w:t>
-      </w:r>
-      <w:proofErr w:type="gramStart"/>
-      <w:r>
-        <w:rPr>
-          <w:lang w:val="en-US"/>
-        </w:rPr>
-        <w:t>calls</w:t>
-      </w:r>
-      <w:proofErr w:type="gramEnd"/>
-      <w:r>
-        <w:rPr>
-          <w:lang w:val="en-US"/>
-        </w:rPr>
-        <w:t xml:space="preserve"> </w:t>
-      </w:r>
-      <w:proofErr w:type="spellStart"/>
-      <w:r>
-        <w:rPr>
-          <w:lang w:val="en-US"/>
-        </w:rPr>
-        <w:t>ToString</w:t>
-      </w:r>
-      <w:proofErr w:type="spellEnd"/>
-      <w:r>
-        <w:rPr>
-          <w:lang w:val="en-US"/>
-        </w:rPr>
-        <w:t>)</w:t>
-      </w:r>
-      <w:r>
-        <w:rPr>
-          <w:lang w:val="en-US"/>
-        </w:rPr>
-        <w:t>: {{.}}</w:t>
-      </w:r>
-      <w:r>
-        <w:rPr>
-          <w:lang w:val="en-US"/>
-        </w:rPr>
-        <w:t xml:space="preserve"> </w:t>
-      </w:r>
-      <w:bookmarkStart w:id="0" w:name="OLE_LINK2"/>
-      <w:r>
-        <w:rPr>
-          <w:lang w:val="en-US"/>
-        </w:rPr>
-        <w:t>‘</w:t>
-      </w:r>
-      <w:bookmarkEnd w:id="0"/>
-    </w:p>
-    <w:p>
-      <w:pPr>
-        <w:tabs>
-          <w:tab w:val="left" w:pos="7594"/>
-        </w:tabs>
-        <w:ind w:left="708"/>
-        <w:rPr>
-          <w:lang w:val="en-US"/>
-        </w:rPr>
-      </w:pPr>
-      <w:r>
-        <w:rPr>
-          <w:lang w:val="en-US"/>
-        </w:rPr>
-        <w:t>{{</w:t>
-      </w:r>
-      <w:proofErr w:type="gramStart"/>
-      <w:r>
-        <w:rPr>
-          <w:lang w:val="en-US"/>
-        </w:rPr>
-        <w:t>/</w:t>
-      </w:r>
-      <w:r>
-        <w:rPr>
-          <w:lang w:val="en-US"/>
-        </w:rPr>
-        <w:t>.</w:t>
-      </w:r>
-      <w:proofErr w:type="spellStart"/>
-      <w:r>
-        <w:rPr>
-          <w:lang w:val="en-US"/>
-        </w:rPr>
-        <w:t>HardwarRevisions</w:t>
-      </w:r>
-      <w:proofErr w:type="spellEnd"/>
-      <w:proofErr w:type="gramEnd"/>
-      <w:r>
-        <w:rPr>
-          <w:lang w:val="en-US"/>
-        </w:rPr>
-        <w:t>}}</w:t>
+      <w:r>
+        <w:rPr>
+          <w:lang w:val="en-US"/>
+        </w:rPr>
+        <w:t>HardwarRevisions}}</w:t>
       </w:r>
     </w:p>
     <w:p>
@@ -448,8 +343,7 @@
           <w:lang w:val="en-US"/>
         </w:rPr>
       </w:pPr>
-      <w:bookmarkStart w:id="1" w:name="OLE_LINK1"/>
-      <w:proofErr w:type="gramStart"/>
+      <w:bookmarkStart w:id="2" w:name="OLE_LINK1"/>
       <w:r>
         <w:rPr>
           <w:lang w:val="en-US"/>
@@ -468,34 +362,17 @@
         </w:rPr>
         <w:t>.</w:t>
       </w:r>
-      <w:proofErr w:type="spellStart"/>
-      <w:proofErr w:type="gramEnd"/>
       <w:r>
         <w:rPr>
           <w:lang w:val="en-US"/>
         </w:rPr>
         <w:t>IsHw</w:t>
       </w:r>
-      <w:proofErr w:type="spellEnd"/>
-      <w:r>
-        <w:rPr>
-          <w:lang w:val="en-US"/>
-        </w:rPr>
-        <w:t xml:space="preserve"> &amp;&amp; .</w:t>
-      </w:r>
-      <w:proofErr w:type="spellStart"/>
-      <w:r>
-        <w:rPr>
-          <w:lang w:val="en-US"/>
-        </w:rPr>
-        <w:t>Name.Contains</w:t>
-      </w:r>
-      <w:proofErr w:type="spellEnd"/>
-      <w:r>
-        <w:rPr>
-          <w:lang w:val="en-US"/>
-        </w:rPr>
-        <w:t>(</w:t>
+      <w:r>
+        <w:rPr>
+          <w:lang w:val="en-US"/>
+        </w:rPr>
+        <w:t xml:space="preserve"> &amp;&amp; .Name.Contains(</w:t>
       </w:r>
       <w:r>
         <w:rPr>
@@ -509,7 +386,6 @@
         </w:rPr>
         <w:t>Item</w:t>
       </w:r>
-      <w:proofErr w:type="gramStart"/>
       <w:r>
         <w:rPr>
           <w:lang w:val="en-US"/>
@@ -522,8 +398,7 @@
         </w:rPr>
         <w:t>)}}</w:t>
       </w:r>
-      <w:bookmarkEnd w:id="1"/>
-      <w:proofErr w:type="gramEnd"/>
+      <w:bookmarkEnd w:id="2"/>
     </w:p>
     <w:p>
       <w:pPr>
@@ -556,14 +431,12 @@
           <w:lang w:val="en-US"/>
         </w:rPr>
       </w:pPr>
-      <w:proofErr w:type="gramStart"/>
       <w:r>
         <w:rPr>
           <w:lang w:val="en-US"/>
         </w:rPr>
         <w:t>{{/}}</w:t>
       </w:r>
-      <w:proofErr w:type="gramEnd"/>
     </w:p>
     <w:p>
       <w:pPr>
@@ -592,7 +465,6 @@
         </w:rPr>
         <w:t>{</w:t>
       </w:r>
-      <w:proofErr w:type="gramStart"/>
       <w:r>
         <w:rPr>
           <w:b/>
@@ -613,9 +485,8 @@
           <w:szCs w:val="28"/>
           <w:lang w:val="en-US"/>
         </w:rPr>
-        <w:t>.Name</w:t>
-      </w:r>
-      <w:proofErr w:type="gramEnd"/>
+        <w:t>.Name}</w:t>
+      </w:r>
       <w:r>
         <w:rPr>
           <w:b/>
@@ -629,17 +500,6 @@
       </w:r>
       <w:r>
         <w:rPr>
-          <w:b/>
-          <w:bCs/>
-          <w:color w:val="FF0000"/>
-          <w:sz w:val="28"/>
-          <w:szCs w:val="28"/>
-          <w:lang w:val="en-US"/>
-        </w:rPr>
-        <w:t>}</w:t>
-      </w:r>
-      <w:r>
-        <w:rPr>
           <w:lang w:val="en-US"/>
         </w:rPr>
         <w:br/>
@@ -668,7 +528,6 @@
           <w:lang w:val="en-US"/>
         </w:rPr>
       </w:pPr>
-      <w:proofErr w:type="gramStart"/>
       <w:r>
         <w:rPr>
           <w:lang w:val="en-US"/>
@@ -687,14 +546,12 @@
         </w:rPr>
         <w:t>{</w:t>
       </w:r>
-      <w:proofErr w:type="gramEnd"/>
       <w:r>
         <w:rPr>
           <w:lang w:val="en-US"/>
         </w:rPr>
         <w:t>.</w:t>
       </w:r>
-      <w:proofErr w:type="spellStart"/>
       <w:r>
         <w:rPr>
           <w:rFonts w:ascii="Cascadia Mono" w:hAnsi="Cascadia Mono" w:cs="Cascadia Mono"/>
@@ -706,7 +563,6 @@
         </w:rPr>
         <w:t>IsMajor</w:t>
       </w:r>
-      <w:proofErr w:type="spellEnd"/>
       <w:r>
         <w:rPr>
           <w:lang w:val="en-US"/>
@@ -717,21 +573,7 @@
         <w:rPr>
           <w:lang w:val="en-US"/>
         </w:rPr>
-        <w:t>{{.Version}:</w:t>
-      </w:r>
-      <w:proofErr w:type="spellStart"/>
-      <w:r>
-        <w:rPr>
-          <w:lang w:val="en-US"/>
-        </w:rPr>
-        <w:t>toupper</w:t>
-      </w:r>
-      <w:proofErr w:type="spellEnd"/>
-      <w:r>
-        <w:rPr>
-          <w:lang w:val="en-US"/>
-        </w:rPr>
-        <w:t>}{{:}}{{.Version</w:t>
+        <w:t>{{.Version}:toupper}{{:}}{{.Version</w:t>
       </w:r>
       <w:r>
         <w:rPr>
@@ -739,14 +581,47 @@
         </w:rPr>
         <w:t>}:</w:t>
       </w:r>
-      <w:proofErr w:type="spellStart"/>
-      <w:r>
-        <w:rPr>
-          <w:lang w:val="en-US"/>
-        </w:rPr>
-        <w:t>tolower</w:t>
-      </w:r>
-      <w:proofErr w:type="spellEnd"/>
+      <w:r>
+        <w:rPr>
+          <w:lang w:val="en-US"/>
+        </w:rPr>
+        <w:t>tolower}</w:t>
+      </w:r>
+      <w:r>
+        <w:rPr>
+          <w:lang w:val="en-US"/>
+        </w:rPr>
+        <w:t>{{/}}</w:t>
+      </w:r>
+    </w:p>
+    <w:p>
+      <w:pPr>
+        <w:tabs>
+          <w:tab w:val="left" w:pos="7594"/>
+        </w:tabs>
+        <w:ind w:left="708"/>
+        <w:rPr>
+          <w:lang w:val="en-US"/>
+        </w:rPr>
+      </w:pPr>
+      <w:r>
+        <w:rPr>
+          <w:lang w:val="en-US"/>
+        </w:rPr>
+        <w:t>{{/</w:t>
+      </w:r>
+      <w:r>
+        <w:rPr>
+          <w:lang w:val="en-US"/>
+        </w:rPr>
+        <w:t>Items.</w:t>
+      </w:r>
+      <w:r>
+        <w:rPr>
+          <w:lang w:val="en-US"/>
+        </w:rPr>
+        <w:t>SoftwareVersions</w:t>
+      </w:r>
       <w:r>
         <w:rPr>
           <w:lang w:val="en-US"/>
@@ -757,6 +632,80 @@
         <w:rPr>
           <w:lang w:val="en-US"/>
         </w:rPr>
+        <w:t>}</w:t>
+      </w:r>
+    </w:p>
+    <w:commentRangeStart w:id="3"/>
+    <w:p>
+      <w:pPr>
+        <w:tabs>
+          <w:tab w:val="left" w:pos="7594"/>
+        </w:tabs>
+        <w:ind w:left="708"/>
+        <w:rPr>
+          <w:lang w:val="en-US"/>
+        </w:rPr>
+      </w:pPr>
+      <w:r>
+        <w:rPr>
+          <w:lang w:val="en-US"/>
+        </w:rPr>
+        <w:fldChar w:fldCharType="begin"/>
+      </w:r>
+      <w:r>
+        <w:rPr>
+          <w:lang w:val="en-US"/>
+        </w:rPr>
+        <w:instrText>HYPERLINK "https://github.com/Amberg/DocxTemplater"</w:instrText>
+      </w:r>
+      <w:r>
+        <w:rPr>
+          <w:lang w:val="en-US"/>
+        </w:rPr>
+      </w:r>
+      <w:r>
+        <w:rPr>
+          <w:lang w:val="en-US"/>
+        </w:rPr>
+        <w:fldChar w:fldCharType="separate"/>
+      </w:r>
+      <w:r>
+        <w:rPr>
+          <w:rStyle w:val="Hyperlink"/>
+          <w:lang w:val="en-US"/>
+        </w:rPr>
+        <w:t>Link To the Repo</w:t>
+      </w:r>
+      <w:r>
+        <w:rPr>
+          <w:lang w:val="en-US"/>
+        </w:rPr>
+        <w:fldChar w:fldCharType="end"/>
+      </w:r>
+      <w:commentRangeEnd w:id="3"/>
+      <w:r>
+        <w:rPr>
+          <w:rStyle w:val="Kommentarzeichen"/>
+          <w:sz w:val="22"/>
+          <w:szCs w:val="22"/>
+          <w:lang w:val="en-US"/>
+        </w:rPr>
+        <w:commentReference w:id="3"/>
+      </w:r>
+    </w:p>
+    <w:p>
+      <w:pPr>
+        <w:tabs>
+          <w:tab w:val="left" w:pos="7594"/>
+        </w:tabs>
+        <w:rPr>
+          <w:lang w:val="en-US"/>
+        </w:rPr>
+      </w:pPr>
+      <w:r>
+        <w:rPr>
+          <w:lang w:val="en-US"/>
+        </w:rPr>
         <w:t>{{/}}</w:t>
       </w:r>
     </w:p>
@@ -765,90 +714,15 @@
         <w:tabs>
           <w:tab w:val="left" w:pos="7594"/>
         </w:tabs>
-        <w:ind w:left="708"/>
-        <w:rPr>
-          <w:lang w:val="en-US"/>
-        </w:rPr>
-      </w:pPr>
-      <w:r>
-        <w:rPr>
-          <w:lang w:val="en-US"/>
-        </w:rPr>
-        <w:t>{{/</w:t>
-      </w:r>
-      <w:proofErr w:type="spellStart"/>
-      <w:r>
-        <w:rPr>
-          <w:lang w:val="en-US"/>
-        </w:rPr>
-        <w:t>Items.</w:t>
-      </w:r>
-      <w:r>
-        <w:rPr>
-          <w:lang w:val="en-US"/>
-        </w:rPr>
-        <w:t>SoftwareVersions</w:t>
-      </w:r>
-      <w:proofErr w:type="spellEnd"/>
-      <w:r>
-        <w:rPr>
-          <w:lang w:val="en-US"/>
-        </w:rPr>
-        <w:t>}</w:t>
-      </w:r>
-      <w:r>
-        <w:rPr>
-          <w:lang w:val="en-US"/>
-        </w:rPr>
-        <w:t>}</w:t>
-      </w:r>
-    </w:p>
-    <w:p>
-      <w:pPr>
-        <w:tabs>
-          <w:tab w:val="left" w:pos="7594"/>
-        </w:tabs>
-        <w:rPr>
-          <w:lang w:val="en-US"/>
-        </w:rPr>
-      </w:pPr>
-      <w:proofErr w:type="gramStart"/>
-      <w:r>
-        <w:rPr>
-          <w:lang w:val="en-US"/>
-        </w:rPr>
-        <w:t>{{/}}</w:t>
-      </w:r>
-      <w:proofErr w:type="gramEnd"/>
-    </w:p>
-    <w:p>
-      <w:pPr>
-        <w:tabs>
-          <w:tab w:val="left" w:pos="7594"/>
-        </w:tabs>
-        <w:rPr>
-          <w:lang w:val="en-US"/>
-        </w:rPr>
-      </w:pPr>
-      <w:r>
-        <w:rPr>
-          <w:lang w:val="en-US"/>
-        </w:rPr>
-        <w:t>{</w:t>
-      </w:r>
-      <w:proofErr w:type="gramStart"/>
-      <w:r>
-        <w:rPr>
-          <w:lang w:val="en-US"/>
-        </w:rPr>
-        <w:t>{:s</w:t>
-      </w:r>
-      <w:proofErr w:type="gramEnd"/>
-      <w:r>
-        <w:rPr>
-          <w:lang w:val="en-US"/>
-        </w:rPr>
-        <w:t>:}}</w:t>
+        <w:rPr>
+          <w:lang w:val="en-US"/>
+        </w:rPr>
+      </w:pPr>
+      <w:r>
+        <w:rPr>
+          <w:lang w:val="en-US"/>
+        </w:rPr>
+        <w:t>{{:s:}}</w:t>
       </w:r>
     </w:p>
     <w:p>
@@ -880,28 +754,7 @@
         <w:rPr>
           <w:lang w:val="en-US"/>
         </w:rPr>
-        <w:t xml:space="preserve">This is a separator ---- Last Element was </w:t>
-      </w:r>
-      <w:proofErr w:type="gramStart"/>
-      <w:r>
-        <w:rPr>
-          <w:lang w:val="en-US"/>
-        </w:rPr>
-        <w:t>{?{</w:t>
-      </w:r>
-      <w:proofErr w:type="gramEnd"/>
-      <w:r>
-        <w:rPr>
-          <w:lang w:val="en-US"/>
-        </w:rPr>
-        <w:t>.</w:t>
-      </w:r>
-      <w:proofErr w:type="spellStart"/>
-      <w:r>
-        <w:rPr>
-          <w:lang w:val="en-US"/>
-        </w:rPr>
-        <w:t>IsH</w:t>
+        <w:t>This is a separator ---- Last Element was {?{.IsH</w:t>
       </w:r>
       <w:r>
         <w:rPr>
@@ -909,7 +762,6 @@
         </w:rPr>
         <w:t>w</w:t>
       </w:r>
-      <w:proofErr w:type="spellEnd"/>
       <w:r>
         <w:rPr>
           <w:lang w:val="en-US"/>
@@ -1002,28 +854,18 @@
                               </w:rPr>
                               <w:t>{{.}:</w:t>
                             </w:r>
-                            <w:proofErr w:type="spellStart"/>
                             <w:r>
                               <w:rPr>
                                 <w:lang w:val="de-CH"/>
                               </w:rPr>
-                              <w:t>img</w:t>
+                              <w:t>img(</w:t>
                             </w:r>
-                            <w:proofErr w:type="spellEnd"/>
-                            <w:r>
-                              <w:rPr>
-                                <w:lang w:val="de-CH"/>
-                              </w:rPr>
-                              <w:t>(</w:t>
-                            </w:r>
-                            <w:proofErr w:type="spellStart"/>
                             <w:r>
                               <w:rPr>
                                 <w:lang w:val="de-CH"/>
                               </w:rPr>
                               <w:t>keepratio</w:t>
                             </w:r>
-                            <w:proofErr w:type="spellEnd"/>
                             <w:r>
                               <w:rPr>
                                 <w:lang w:val="de-CH"/>
@@ -1072,28 +914,18 @@
                         </w:rPr>
                         <w:t>{{.}:</w:t>
                       </w:r>
-                      <w:proofErr w:type="spellStart"/>
                       <w:r>
                         <w:rPr>
                           <w:lang w:val="de-CH"/>
                         </w:rPr>
-                        <w:t>img</w:t>
+                        <w:t>img(</w:t>
                       </w:r>
-                      <w:proofErr w:type="spellEnd"/>
-                      <w:r>
-                        <w:rPr>
-                          <w:lang w:val="de-CH"/>
-                        </w:rPr>
-                        <w:t>(</w:t>
-                      </w:r>
-                      <w:proofErr w:type="spellStart"/>
                       <w:r>
                         <w:rPr>
                           <w:lang w:val="de-CH"/>
                         </w:rPr>
                         <w:t>keepratio</w:t>
                       </w:r>
-                      <w:proofErr w:type="spellEnd"/>
                       <w:r>
                         <w:rPr>
                           <w:lang w:val="de-CH"/>
@@ -1135,59 +967,23 @@
         <w:rPr>
           <w:lang w:val="en-US"/>
         </w:rPr>
-        <w:t xml:space="preserve">Access Images Relative to </w:t>
-      </w:r>
-      <w:proofErr w:type="gramStart"/>
-      <w:r>
-        <w:rPr>
-          <w:lang w:val="en-US"/>
-        </w:rPr>
-        <w:t>item</w:t>
-      </w:r>
-      <w:proofErr w:type="gramEnd"/>
-      <w:r>
-        <w:rPr>
-          <w:lang w:val="en-US"/>
-        </w:rPr>
-        <w:t xml:space="preserve"> with explicit operator</w:t>
-      </w:r>
-      <w:proofErr w:type="gramStart"/>
-      <w:r>
-        <w:rPr>
-          <w:lang w:val="en-US"/>
-        </w:rPr>
-        <w:t xml:space="preserve"> ..</w:t>
-      </w:r>
-      <w:proofErr w:type="gramEnd"/>
-    </w:p>
-    <w:p>
-      <w:pPr>
-        <w:tabs>
-          <w:tab w:val="left" w:pos="7594"/>
-        </w:tabs>
-        <w:rPr>
-          <w:lang w:val="en-US"/>
-        </w:rPr>
-      </w:pPr>
-      <w:r>
-        <w:rPr>
-          <w:lang w:val="en-US"/>
-        </w:rPr>
-        <w:t>{{</w:t>
-      </w:r>
-      <w:proofErr w:type="gramStart"/>
-      <w:r>
-        <w:rPr>
-          <w:lang w:val="en-US"/>
-        </w:rPr>
-        <w:t>#..</w:t>
-      </w:r>
-      <w:proofErr w:type="gramEnd"/>
-      <w:r>
-        <w:rPr>
-          <w:lang w:val="en-US"/>
-        </w:rPr>
-        <w:t>Images}}</w:t>
+        <w:t>Access Images Relative to item with explicit operator ..</w:t>
+      </w:r>
+    </w:p>
+    <w:p>
+      <w:pPr>
+        <w:tabs>
+          <w:tab w:val="left" w:pos="7594"/>
+        </w:tabs>
+        <w:rPr>
+          <w:lang w:val="en-US"/>
+        </w:rPr>
+      </w:pPr>
+      <w:r>
+        <w:rPr>
+          <w:lang w:val="en-US"/>
+        </w:rPr>
+        <w:t>{{#..Images}}</w:t>
       </w:r>
       <w:r>
         <w:rPr>
@@ -1237,33 +1033,11 @@
                               </w:rPr>
                               <w:t>{{.}:</w:t>
                             </w:r>
-                            <w:proofErr w:type="spellStart"/>
                             <w:r>
                               <w:rPr>
                                 <w:lang w:val="de-CH"/>
                               </w:rPr>
-                              <w:t>img</w:t>
-                            </w:r>
-                            <w:proofErr w:type="spellEnd"/>
-                            <w:r>
-                              <w:rPr>
-                                <w:lang w:val="de-CH"/>
-                              </w:rPr>
-                              <w:t>(</w:t>
-                            </w:r>
-                            <w:proofErr w:type="spellStart"/>
-                            <w:r>
-                              <w:rPr>
-                                <w:lang w:val="de-CH"/>
-                              </w:rPr>
-                              <w:t>keepratio</w:t>
-                            </w:r>
-                            <w:proofErr w:type="spellEnd"/>
-                            <w:r>
-                              <w:rPr>
-                                <w:lang w:val="de-CH"/>
-                              </w:rPr>
-                              <w:t>)</w:t>
+                              <w:t>img(keepratio)</w:t>
                             </w:r>
                             <w:r>
                               <w:rPr>
@@ -1303,33 +1077,11 @@
                         </w:rPr>
                         <w:t>{{.}:</w:t>
                       </w:r>
-                      <w:proofErr w:type="spellStart"/>
                       <w:r>
                         <w:rPr>
                           <w:lang w:val="de-CH"/>
                         </w:rPr>
-                        <w:t>img</w:t>
-                      </w:r>
-                      <w:proofErr w:type="spellEnd"/>
-                      <w:r>
-                        <w:rPr>
-                          <w:lang w:val="de-CH"/>
-                        </w:rPr>
-                        <w:t>(</w:t>
-                      </w:r>
-                      <w:proofErr w:type="spellStart"/>
-                      <w:r>
-                        <w:rPr>
-                          <w:lang w:val="de-CH"/>
-                        </w:rPr>
-                        <w:t>keepratio</w:t>
-                      </w:r>
-                      <w:proofErr w:type="spellEnd"/>
-                      <w:r>
-                        <w:rPr>
-                          <w:lang w:val="de-CH"/>
-                        </w:rPr>
-                        <w:t>)</w:t>
+                        <w:t>img(keepratio)</w:t>
                       </w:r>
                       <w:r>
                         <w:rPr>
@@ -1409,6 +1161,63 @@
     </w:sectPr>
   </w:body>
 </w:document>
+</file>
+
+<file path=word/comments.xml><?xml version="1.0" encoding="utf-8"?>
+<w:comments xmlns:wpc="http://schemas.microsoft.com/office/word/2010/wordprocessingCanvas" xmlns:cx="http://schemas.microsoft.com/office/drawing/2014/chartex" xmlns:cx1="http://schemas.microsoft.com/office/drawing/2015/9/8/chartex" xmlns:cx2="http://schemas.microsoft.com/office/drawing/2015/10/21/chartex" xmlns:cx3="http://schemas.microsoft.com/office/drawing/2016/5/9/chartex" xmlns:cx4="http://schemas.microsoft.com/office/drawing/2016/5/10/chartex" xmlns:cx5="http://schemas.microsoft.com/office/drawing/2016/5/11/chartex" xmlns:cx6="http://schemas.microsoft.com/office/drawing/2016/5/12/chartex" xmlns:cx7="http://schemas.microsoft.com/office/drawing/2016/5/13/chartex" xmlns:cx8="http://schemas.microsoft.com/office/drawing/2016/5/14/chartex" xmlns:mc="http://schemas.openxmlformats.org/markup-compatibility/2006" xmlns:aink="http://schemas.microsoft.com/office/drawing/2016/ink" xmlns:am3d="http://schemas.microsoft.com/office/drawing/2017/model3d" xmlns:o="urn:schemas-microsoft-com:office:office" xmlns:oel="http://schemas.microsoft.com/office/2019/extlst" xmlns:r="http://schemas.openxmlformats.org/officeDocument/2006/relationships" xmlns:m="http://schemas.openxmlformats.org/officeDocument/2006/math" xmlns:v="urn:schemas-microsoft-com:vml" xmlns:wp14="http://schemas.microsoft.com/office/word/2010/wordprocessingDrawing" xmlns:wp="http://schemas.openxmlformats.org/drawingml/2006/wordprocessingDrawing" xmlns:w10="urn:schemas-microsoft-com:office:word" xmlns:w="http://schemas.openxmlformats.org/wordprocessingml/2006/main" xmlns:w14="http://schemas.microsoft.com/office/word/2010/wordml" xmlns:w15="http://schemas.microsoft.com/office/word/2012/wordml" xmlns:w16cex="http://schemas.microsoft.com/office/word/2018/wordml/cex" xmlns:w16cid="http://schemas.microsoft.com/office/word/2016/wordml/cid" xmlns:w16="http://schemas.microsoft.com/office/word/2018/wordml" xmlns:w16du="http://schemas.microsoft.com/office/word/2023/wordml/word16du" xmlns:w16sdtdh="http://schemas.microsoft.com/office/word/2020/wordml/sdtdatahash" xmlns:w16sdtfl="http://schemas.microsoft.com/office/word/2024/wordml/sdtformatlock" xmlns:w16se="http://schemas.microsoft.com/office/word/2015/wordml/symex" xmlns:wpg="http://schemas.microsoft.com/office/word/2010/wordprocessingGroup" xmlns:wpi="http://schemas.microsoft.com/office/word/2010/wordprocessingInk" xmlns:wne="http://schemas.microsoft.com/office/word/2006/wordml" xmlns:wps="http://schemas.microsoft.com/office/word/2010/wordprocessingShape" mc:Ignorable="w14 w15 w16se w16cid w16 w16cex w16sdtdh w16sdtfl w16du wp14">
+  <w:comment w:id="0" w:author="Autor" w:initials="A">
+    <w:p>
+      <w:pPr>
+        <w:pStyle w:val="Kommentartext"/>
+      </w:pPr>
+      <w:r>
+        <w:rPr>
+          <w:rStyle w:val="Kommentarzeichen"/>
+        </w:rPr>
+        <w:annotationRef/>
+      </w:r>
+      <w:r>
+        <w:rPr>
+          <w:lang w:val="de-CH"/>
+        </w:rPr>
+        <w:t>This is a comment</w:t>
+      </w:r>
+    </w:p>
+  </w:comment>
+  <w:comment w:id="3" w:author="Autor" w:initials="A">
+    <w:p>
+      <w:pPr>
+        <w:pStyle w:val="Kommentartext"/>
+      </w:pPr>
+      <w:r>
+        <w:rPr>
+          <w:rStyle w:val="Kommentarzeichen"/>
+        </w:rPr>
+        <w:annotationRef/>
+      </w:r>
+      <w:r>
+        <w:rPr>
+          <w:lang w:val="de-CH"/>
+        </w:rPr>
+        <w:t>Link with a comment</w:t>
+      </w:r>
+    </w:p>
+  </w:comment>
+</w:comments>
+</file>
+
+<file path=word/commentsExtended.xml><?xml version="1.0" encoding="utf-8"?>
+<w15:commentsEx xmlns:wpc="http://schemas.microsoft.com/office/word/2010/wordprocessingCanvas" xmlns:cx="http://schemas.microsoft.com/office/drawing/2014/chartex" xmlns:cx1="http://schemas.microsoft.com/office/drawing/2015/9/8/chartex" xmlns:cx2="http://schemas.microsoft.com/office/drawing/2015/10/21/chartex" xmlns:cx3="http://schemas.microsoft.com/office/drawing/2016/5/9/chartex" xmlns:cx4="http://schemas.microsoft.com/office/drawing/2016/5/10/chartex" xmlns:cx5="http://schemas.microsoft.com/office/drawing/2016/5/11/chartex" xmlns:cx6="http://schemas.microsoft.com/office/drawing/2016/5/12/chartex" xmlns:cx7="http://schemas.microsoft.com/office/drawing/2016/5/13/chartex" xmlns:cx8="http://schemas.microsoft.com/office/drawing/2016/5/14/chartex" xmlns:mc="http://schemas.openxmlformats.org/markup-compatibility/2006" xmlns:aink="http://schemas.microsoft.com/office/drawing/2016/ink" xmlns:am3d="http://schemas.microsoft.com/office/drawing/2017/model3d" xmlns:o="urn:schemas-microsoft-com:office:office" xmlns:oel="http://schemas.microsoft.com/office/2019/extlst" xmlns:r="http://schemas.openxmlformats.org/officeDocument/2006/relationships" xmlns:m="http://schemas.openxmlformats.org/officeDocument/2006/math" xmlns:v="urn:schemas-microsoft-com:vml" xmlns:wp14="http://schemas.microsoft.com/office/word/2010/wordprocessingDrawing" xmlns:wp="http://schemas.openxmlformats.org/drawingml/2006/wordprocessingDrawing" xmlns:w10="urn:schemas-microsoft-com:office:word" xmlns:w="http://schemas.openxmlformats.org/wordprocessingml/2006/main" xmlns:w14="http://schemas.microsoft.com/office/word/2010/wordml" xmlns:w15="http://schemas.microsoft.com/office/word/2012/wordml" xmlns:w16cex="http://schemas.microsoft.com/office/word/2018/wordml/cex" xmlns:w16cid="http://schemas.microsoft.com/office/word/2016/wordml/cid" xmlns:w16="http://schemas.microsoft.com/office/word/2018/wordml" xmlns:w16du="http://schemas.microsoft.com/office/word/2023/wordml/word16du" xmlns:w16sdtdh="http://schemas.microsoft.com/office/word/2020/wordml/sdtdatahash" xmlns:w16sdtfl="http://schemas.microsoft.com/office/word/2024/wordml/sdtformatlock" xmlns:w16se="http://schemas.microsoft.com/office/word/2015/wordml/symex" xmlns:wpg="http://schemas.microsoft.com/office/word/2010/wordprocessingGroup" xmlns:wpi="http://schemas.microsoft.com/office/word/2010/wordprocessingInk" xmlns:wne="http://schemas.microsoft.com/office/word/2006/wordml" xmlns:wps="http://schemas.microsoft.com/office/word/2010/wordprocessingShape" mc:Ignorable="w14 w15 w16se w16cid w16 w16cex w16sdtdh w16sdtfl w16du wp14">
+  <w15:commentEx w15:paraId="2E200014" w15:done="0"/>
+  <w15:commentEx w15:paraId="2BC1BFDF" w15:done="0"/>
+</w15:commentsEx>
+</file>
+
+<file path=word/commentsIds.xml><?xml version="1.0" encoding="utf-8"?>
+<w16cid:commentsIds xmlns:wpc="http://schemas.microsoft.com/office/word/2010/wordprocessingCanvas" xmlns:cx="http://schemas.microsoft.com/office/drawing/2014/chartex" xmlns:cx1="http://schemas.microsoft.com/office/drawing/2015/9/8/chartex" xmlns:cx2="http://schemas.microsoft.com/office/drawing/2015/10/21/chartex" xmlns:cx3="http://schemas.microsoft.com/office/drawing/2016/5/9/chartex" xmlns:cx4="http://schemas.microsoft.com/office/drawing/2016/5/10/chartex" xmlns:cx5="http://schemas.microsoft.com/office/drawing/2016/5/11/chartex" xmlns:cx6="http://schemas.microsoft.com/office/drawing/2016/5/12/chartex" xmlns:cx7="http://schemas.microsoft.com/office/drawing/2016/5/13/chartex" xmlns:cx8="http://schemas.microsoft.com/office/drawing/2016/5/14/chartex" xmlns:mc="http://schemas.openxmlformats.org/markup-compatibility/2006" xmlns:aink="http://schemas.microsoft.com/office/drawing/2016/ink" xmlns:am3d="http://schemas.microsoft.com/office/drawing/2017/model3d" xmlns:o="urn:schemas-microsoft-com:office:office" xmlns:oel="http://schemas.microsoft.com/office/2019/extlst" xmlns:r="http://schemas.openxmlformats.org/officeDocument/2006/relationships" xmlns:m="http://schemas.openxmlformats.org/officeDocument/2006/math" xmlns:v="urn:schemas-microsoft-com:vml" xmlns:wp14="http://schemas.microsoft.com/office/word/2010/wordprocessingDrawing" xmlns:wp="http://schemas.openxmlformats.org/drawingml/2006/wordprocessingDrawing" xmlns:w10="urn:schemas-microsoft-com:office:word" xmlns:w="http://schemas.openxmlformats.org/wordprocessingml/2006/main" xmlns:w14="http://schemas.microsoft.com/office/word/2010/wordml" xmlns:w15="http://schemas.microsoft.com/office/word/2012/wordml" xmlns:w16cex="http://schemas.microsoft.com/office/word/2018/wordml/cex" xmlns:w16cid="http://schemas.microsoft.com/office/word/2016/wordml/cid" xmlns:w16="http://schemas.microsoft.com/office/word/2018/wordml" xmlns:w16du="http://schemas.microsoft.com/office/word/2023/wordml/word16du" xmlns:w16sdtdh="http://schemas.microsoft.com/office/word/2020/wordml/sdtdatahash" xmlns:w16sdtfl="http://schemas.microsoft.com/office/word/2024/wordml/sdtformatlock" xmlns:w16se="http://schemas.microsoft.com/office/word/2015/wordml/symex" xmlns:wpg="http://schemas.microsoft.com/office/word/2010/wordprocessingGroup" xmlns:wpi="http://schemas.microsoft.com/office/word/2010/wordprocessingInk" xmlns:wne="http://schemas.microsoft.com/office/word/2006/wordml" xmlns:wps="http://schemas.microsoft.com/office/word/2010/wordprocessingShape" mc:Ignorable="w14 w15 w16se w16cid w16 w16cex w16sdtdh w16sdtfl w16du wp14">
+  <w16cid:commentId w16cid:paraId="2E200014" w16cid:durableId="3762EFBD"/>
+  <w16cid:commentId w16cid:paraId="2BC1BFDF" w16cid:durableId="60F9EB32"/>
+</w16cid:commentsIds>
 </file>
 
 <file path=word/endnotes.xml><?xml version="1.0" encoding="utf-8"?>
@@ -1858,17 +1667,17 @@
     <w:lsdException w:name="Unresolved Mention" w:semiHidden="1" w:unhideWhenUsed="1"/>
     <w:lsdException w:name="Smart Link" w:semiHidden="1" w:unhideWhenUsed="1"/>
   </w:latentStyles>
-  <w:style w:type="paragraph" w:default="1" w:styleId="Normal">
+  <w:style w:type="paragraph" w:default="1" w:styleId="Standard">
     <w:name w:val="Normal"/>
     <w:qFormat/>
   </w:style>
-  <w:style w:type="character" w:default="1" w:styleId="DefaultParagraphFont">
+  <w:style w:type="character" w:default="1" w:styleId="Absatz-Standardschriftart">
     <w:name w:val="Default Paragraph Font"/>
     <w:uiPriority w:val="1"/>
     <w:semiHidden/>
     <w:unhideWhenUsed/>
   </w:style>
-  <w:style w:type="table" w:default="1" w:styleId="TableNormal">
+  <w:style w:type="table" w:default="1" w:styleId="NormaleTabelle">
     <w:name w:val="Normal Table"/>
     <w:uiPriority w:val="99"/>
     <w:semiHidden/>
@@ -1883,16 +1692,16 @@
       </w:tblCellMar>
     </w:tblPr>
   </w:style>
-  <w:style w:type="numbering" w:default="1" w:styleId="NoList">
+  <w:style w:type="numbering" w:default="1" w:styleId="KeineListe">
     <w:name w:val="No List"/>
     <w:uiPriority w:val="99"/>
     <w:semiHidden/>
     <w:unhideWhenUsed/>
   </w:style>
-  <w:style w:type="paragraph" w:styleId="Header">
+  <w:style w:type="paragraph" w:styleId="Kopfzeile">
     <w:name w:val="header"/>
-    <w:basedOn w:val="Normal"/>
-    <w:link w:val="HeaderChar"/>
+    <w:basedOn w:val="Standard"/>
+    <w:link w:val="KopfzeileZchn"/>
     <w:uiPriority w:val="99"/>
     <w:unhideWhenUsed/>
     <w:rsid w:val="00F16287"/>
@@ -1904,17 +1713,17 @@
       <w:spacing w:after="0" w:line="240" w:lineRule="auto"/>
     </w:pPr>
   </w:style>
-  <w:style w:type="character" w:customStyle="1" w:styleId="HeaderChar">
-    <w:name w:val="Header Char"/>
-    <w:basedOn w:val="DefaultParagraphFont"/>
-    <w:link w:val="Header"/>
+  <w:style w:type="character" w:customStyle="1" w:styleId="KopfzeileZchn">
+    <w:name w:val="Kopfzeile Zchn"/>
+    <w:basedOn w:val="Absatz-Standardschriftart"/>
+    <w:link w:val="Kopfzeile"/>
     <w:uiPriority w:val="99"/>
     <w:rsid w:val="00F16287"/>
   </w:style>
-  <w:style w:type="paragraph" w:styleId="Footer">
+  <w:style w:type="paragraph" w:styleId="Fuzeile">
     <w:name w:val="footer"/>
-    <w:basedOn w:val="Normal"/>
-    <w:link w:val="FooterChar"/>
+    <w:basedOn w:val="Standard"/>
+    <w:link w:val="FuzeileZchn"/>
     <w:uiPriority w:val="99"/>
     <w:unhideWhenUsed/>
     <w:rsid w:val="00F16287"/>
@@ -1926,12 +1735,101 @@
       <w:spacing w:after="0" w:line="240" w:lineRule="auto"/>
     </w:pPr>
   </w:style>
-  <w:style w:type="character" w:customStyle="1" w:styleId="FooterChar">
-    <w:name w:val="Footer Char"/>
-    <w:basedOn w:val="DefaultParagraphFont"/>
-    <w:link w:val="Footer"/>
+  <w:style w:type="character" w:customStyle="1" w:styleId="FuzeileZchn">
+    <w:name w:val="Fußzeile Zchn"/>
+    <w:basedOn w:val="Absatz-Standardschriftart"/>
+    <w:link w:val="Fuzeile"/>
     <w:uiPriority w:val="99"/>
     <w:rsid w:val="00F16287"/>
+  </w:style>
+  <w:style w:type="character" w:styleId="Kommentarzeichen">
+    <w:name w:val="annotation reference"/>
+    <w:basedOn w:val="Absatz-Standardschriftart"/>
+    <w:uiPriority w:val="99"/>
+    <w:semiHidden/>
+    <w:unhideWhenUsed/>
+    <w:rsid w:val="00746239"/>
+    <w:rPr>
+      <w:sz w:val="16"/>
+      <w:szCs w:val="16"/>
+    </w:rPr>
+  </w:style>
+  <w:style w:type="paragraph" w:styleId="Kommentartext">
+    <w:name w:val="annotation text"/>
+    <w:basedOn w:val="Standard"/>
+    <w:link w:val="KommentartextZchn"/>
+    <w:uiPriority w:val="99"/>
+    <w:unhideWhenUsed/>
+    <w:rsid w:val="00746239"/>
+    <w:pPr>
+      <w:spacing w:line="240" w:lineRule="auto"/>
+    </w:pPr>
+    <w:rPr>
+      <w:sz w:val="20"/>
+      <w:szCs w:val="20"/>
+    </w:rPr>
+  </w:style>
+  <w:style w:type="character" w:customStyle="1" w:styleId="KommentartextZchn">
+    <w:name w:val="Kommentartext Zchn"/>
+    <w:basedOn w:val="Absatz-Standardschriftart"/>
+    <w:link w:val="Kommentartext"/>
+    <w:uiPriority w:val="99"/>
+    <w:rsid w:val="00746239"/>
+    <w:rPr>
+      <w:sz w:val="20"/>
+      <w:szCs w:val="20"/>
+    </w:rPr>
+  </w:style>
+  <w:style w:type="paragraph" w:styleId="Kommentarthema">
+    <w:name w:val="annotation subject"/>
+    <w:basedOn w:val="Kommentartext"/>
+    <w:next w:val="Kommentartext"/>
+    <w:link w:val="KommentarthemaZchn"/>
+    <w:uiPriority w:val="99"/>
+    <w:semiHidden/>
+    <w:unhideWhenUsed/>
+    <w:rsid w:val="00746239"/>
+    <w:rPr>
+      <w:b/>
+      <w:bCs/>
+    </w:rPr>
+  </w:style>
+  <w:style w:type="character" w:customStyle="1" w:styleId="KommentarthemaZchn">
+    <w:name w:val="Kommentarthema Zchn"/>
+    <w:basedOn w:val="KommentartextZchn"/>
+    <w:link w:val="Kommentarthema"/>
+    <w:uiPriority w:val="99"/>
+    <w:semiHidden/>
+    <w:rsid w:val="00746239"/>
+    <w:rPr>
+      <w:b/>
+      <w:bCs/>
+      <w:sz w:val="20"/>
+      <w:szCs w:val="20"/>
+    </w:rPr>
+  </w:style>
+  <w:style w:type="character" w:styleId="Hyperlink">
+    <w:name w:val="Hyperlink"/>
+    <w:basedOn w:val="Absatz-Standardschriftart"/>
+    <w:uiPriority w:val="99"/>
+    <w:unhideWhenUsed/>
+    <w:rsid w:val="00746239"/>
+    <w:rPr>
+      <w:color w:val="0563C1" w:themeColor="hyperlink"/>
+      <w:u w:val="single"/>
+    </w:rPr>
+  </w:style>
+  <w:style w:type="character" w:styleId="NichtaufgelsteErwhnung">
+    <w:name w:val="Unresolved Mention"/>
+    <w:basedOn w:val="Absatz-Standardschriftart"/>
+    <w:uiPriority w:val="99"/>
+    <w:semiHidden/>
+    <w:unhideWhenUsed/>
+    <w:rsid w:val="00746239"/>
+    <w:rPr>
+      <w:color w:val="605E5C"/>
+      <w:shd w:val="clear" w:color="auto" w:fill="E1DFDD"/>
+    </w:rPr>
   </w:style>
 </w:styles>
 </file>

</xml_diff>